<commit_message>
Spell and grammar correction
</commit_message>
<xml_diff>
--- a/docs/manuscript/mpm_manuscript.docx
+++ b/docs/manuscript/mpm_manuscript.docx
@@ -198,7 +198,7 @@
         <w:pStyle w:val="FirstParagraph"/>
       </w:pPr>
       <w:r>
-        <w:t xml:space="preserve">The collation of published demographic data in databases such as PanTHERIA (Jones et al. 2009), AnAge (de Magalhães and Costa 2009), Myhrvold et al.’s (2015) amniote life history database, and COM(P)ADRE (Salguero-Gómez et al. 2015, Salguero-Gómez et al. 2016a), has facilitated fascinating comparative analyses in the fields of ecology, evolution, and demography (e.g. Garratt et al. 2013, Adler et al. 2014, Healy et al. 2014, Fristoe et al. 2017). By leveraging open-source databases that combine data from hundreds of individual studies, researchers are able to test hypotheses of interest at taxonomic, spatial, and temporal scales that would not otherwise be possible. However, analyzing</w:t>
+        <w:t xml:space="preserve">The collation of published demographic data in databases such as PanTHERIA (Jones et al. 2009), AnAge (de Magalhães and Costa 2009), Myhrvold et al.’s (2015) amniote life history database, and COM(P)ADRE (Salguero-Gómez et al. 2015, Salguero-Gómez et al. 2016a), has facilitated fascinating comparative analyses in the fields of ecology, evolution, and demography (e.g. Garratt et al. 2013, Adler et al. 2014, Healy et al. 2014, Fristoe et al. 2017). By leveraging open-source databases that combine data from hundreds of individual studies, researchers are able to test hypotheses of interest at taxonomic, spatial, and temporal scales that would not otherwise be possible. However, analysing</w:t>
       </w:r>
       <w:r>
         <w:t xml:space="preserve"> </w:t>
@@ -218,7 +218,7 @@
         <w:pStyle w:val="BodyText"/>
       </w:pPr>
       <w:r>
-        <w:t xml:space="preserve">One challenge in working with large collections of published data is that it can be difficult to understand and model sources of underlying uncertainty. For instance, the demographic parameters reported in the databases noted above have almost always been estimated from a sample of individuals from some larger population of interest, and therefore have inherent sampling uncertainty. However, parameter-specific sample sizes and standard errors are rarely available, and are often difficult to obtain even from the original data sources. These original studies, which produce the parameter estimates that are later compiled in demographic databases, almost always account for sampling uncertainty in their own analyses. However, studies that subsequently analyze parameter estimates compiled in demographic databases rarely account for uncertainty in those estimates — an omission that may lead to bias or overconfidence (Biggs et al. 2009).</w:t>
+        <w:t xml:space="preserve">One challenge in working with large collections of published data is that it can be difficult to understand and model sources of underlying uncertainty. For instance, the demographic parameters reported in the databases noted above have almost always been estimated from a sample of individuals from some larger population of interest, and therefore have inherent sampling uncertainty. However, parameter-specific sample sizes and standard errors are rarely available, and are often difficult to obtain even from the original data sources. These original studies, which produce the parameter estimates that are later compiled in demographic databases, almost always account for sampling uncertainty in their own analyses. However, studies that subsequently analyse parameter estimates compiled in demographic databases rarely account for uncertainty in those estimates — an omission that may lead to bias or overconfidence (Biggs et al. 2009).</w:t>
       </w:r>
     </w:p>
     <w:p>
@@ -2322,7 +2322,7 @@
         <w:t xml:space="preserve"> </w:t>
       </w:r>
       <w:r>
-        <w:t xml:space="preserve">of the mortality distribution (sensu. Baudisch 2011), where shape indicates how sharply mortality rates increase with age following reproductive maturity. Evolutionary biologists have long been interested in understanding variation in mortality trajectories in the context of evolutionary theories on senescence, but previous metrics used to compare rates of senescence may have conflated variation in the shape of mortality trajectories and variation in the average level of mortality (i.e. the inverse of life expectancy). Measures of shape proposed by Baudisch and colleagues (Baudisch 2011, Baudisch et al. 2013, Wrycza et al. 2015) are mathematically independent of life expectancy, and therefore well-suited for comparative analyses. Whether shape is biologically independent of life expectancy is a separate question, and indeed an analysis by Baudisch et al. (2013) (based on MPMs for 290 angiosperm species) found a positive relationship between life expectancy and the shape of mortality trajectories. Apart from that analysis, a number of other studies have used estimates of life expectancy and shape derived from MPMs in COM(P)ADRE, primarily in studies of life history variation (e.g. Salguero-Gómez et al. 2016, Healy et al. 2019).</w:t>
+        <w:t xml:space="preserve">of the mortality distribution (sensu Baudisch 2011), where shape indicates how sharply mortality rates increase with age following reproductive maturity. Evolutionary biologists have long been interested in understanding variation in mortality trajectories in the context of evolutionary theories on senescence, but previous metrics used to compare rates of senescence may have conflated variation in the shape of mortality trajectories and variation in the average level of mortality (i.e. the inverse of life expectancy). Measures of shape proposed by Baudisch and colleagues (Baudisch 2011, Baudisch et al. 2013, Wrycza et al. 2015) are mathematically independent of life expectancy, and therefore well-suited for comparative analyses. Whether shape is biologically independent of life expectancy is a separate question, and indeed an analysis by Baudisch et al. (2013) (based on MPMs for 290 angiosperm species) found a positive relationship between life expectancy and the shape of mortality trajectories. Apart from that analysis, a number of other studies have used estimates of life expectancy and shape derived from MPMs in COM(P)ADRE, primarily in studies of life history variation (e.g. Salguero-Gómez et al. 2016, Healy et al. 2019).</w:t>
       </w:r>
     </w:p>
     <w:p>
@@ -2447,7 +2447,7 @@
         </m:r>
       </m:oMath>
       <w:r>
-        <w:t xml:space="preserve">. To estimate shape we used a metric proposed by Baudisch and Stott (2019), which compares the area under a survivorship trajectory to the area under a reference trajectory that assumes constant mortality with age. The metric can take any continuous value between –0.5 (maximal negative senescence; all individuals die at the age of maturity) and +0.5 (maximal senescence; all individuals die at the age of maximum longevity), with a value of 0 indicating a constant rate of mortality with age (negligible senescence). Values of shape that are greater than, equal to, or less than zero correspond to Type I, II, and III survivorship curves, respectively. When deriving a survivorship trajectory from an MPM, it is guaranteed that the apparent mortality rate will approach a plateau as the stage distribution approaches its equilibrium (Horvitz and Tuljapurkar 2008). To avoid bias from artifactual mortality plateaus, we calculated shape from truncated survivorship trajectories, limited to the period prior to a cohort reaching its quasi-stable distribution (based on a distance threshold of 1%; see Appendix S1 section 4 for further details).</w:t>
+        <w:t xml:space="preserve">. To estimate shape we used a metric proposed by Baudisch and Stott (2019), which compares the area under a survivorship trajectory to the area under a reference trajectory that assumes constant mortality with age. The metric can take any continuous value between –0.5 (maximal negative senescence; all individuals die at the age of maturity) and +0.5 (maximal senescence; all individuals die at the age of maximum longevity), with a value of 0 indicating a constant rate of mortality with age (negligible senescence). Values of shape that are greater than, equal to, or less than zero correspond to Type I, II, and III survivorship curves, respectively. When deriving a survivorship trajectory from an MPM, it is guaranteed that the apparent mortality rate will approach a plateau as the stage distribution approaches its equilibrium (Horvitz and Tuljapurkar 2008). To avoid bias from artefactual mortality plateaus, we calculated shape from truncated survivorship trajectories, limited to the period prior to a cohort reaching its quasi-stable distribution (based on a distance threshold of 1%; see Appendix S1 section 4 for further details).</w:t>
       </w:r>
     </w:p>
     <w:p>
@@ -4633,7 +4633,7 @@
         <w:pStyle w:val="BodyText"/>
       </w:pPr>
       <w:r>
-        <w:t xml:space="preserve">Despite the mismatch between point estimates and sampling distributions, accounting for sampling uncertainty in our test of the relationship between life expectancy and shape only moderately affected the overall result (Fig. 3). With respect to the slope parameter β, the posterior distribution from the point estimate model was centered slightly to the left of zero (P[β &gt; 0] = 0.37), whereas the corresponding posterior from the sampling uncertainty model was shifted somewhat to the right (P[β &gt; 0] = 0.75) (Fig. 3B), indicating stronger evidence for a positive relationship between life expectancy and shape. Counterintuitively, there was actually less posterior uncertainty in β in the sampling uncertainty model than the point estimate model, because the sampling distributions were more tightly clustered than the point estimates.</w:t>
+        <w:t xml:space="preserve">Despite the mismatch between point estimates and sampling distributions, accounting for sampling uncertainty in our test of the relationship between life expectancy and shape only moderately affected the overall result (Fig. 3). With respect to the slope parameter β, the posterior distribution from the point estimate model was centred slightly to the left of zero (P[β &gt; 0] = 0.37), whereas the corresponding posterior from the sampling uncertainty model was shifted somewhat to the right (P[β &gt; 0] = 0.75) (Fig. 3B), indicating stronger evidence for a positive relationship between life expectancy and shape. Counterintuitively, there was actually less posterior uncertainty in β in the sampling uncertainty model than the point estimate model, because the sampling distributions were more tightly clustered than the point estimates.</w:t>
       </w:r>
     </w:p>
     <w:bookmarkEnd w:id="33"/>
@@ -4651,7 +4651,21 @@
         <w:pStyle w:val="FirstParagraph"/>
       </w:pPr>
       <w:r>
-        <w:t xml:space="preserve">Despite the relatively small sample sizes underlying some estimates of recruitment (the three smallest sample sizes of reproductive individuals were 8, 12, and 13, respectively), results from the point estimate model and the sampling uncertainty model were virtually identical (Fig. 4A). Both identified temperature deviations in monthly lags 7-9 (February-April prior to the start of the transition interval in July) as having a positive effect on recruitment. If we simplify our model and just consider the relationship between recruitment and mean Spring temperature deviations (see full model specification in Appendix S1), we find that again the model of point estimates is similar to the model incorporating sampling uncertainty (Fig. 4B). The estimate of the temperature coefficient was about 5% higher, and the variance of that estimate about 10% higher, in the model incorporating sampling uncertainty compared to the model of point estimates. A difference of this magnitude is unlikely to qualitatively change any inferences drawn from a model.</w:t>
+        <w:t xml:space="preserve">Despite the relatively small sample sizes underlying some estimates of recruitment (the three smallest sample sizes of reproductive individuals were 8, 12, and 13, respectively), results from the point estimate model and the sampling uncertainty model were virtually identical (Fig. 4A). Both identified temperature deviations in monthly lags 7-9 (February-April prior to the start of the transition interval in July) as having a positive effect on recruitment. If we simplify our model and just consider the relationship between recruitment and mean spring temperature deviations (see full model specification in Appendix S1), we find that again the model of point estimates is similar to the model incorporating sampling uncertainty (Fig. 4B). The estimate of the temperature coefficient</w:t>
+      </w:r>
+      <w:r>
+        <w:t xml:space="preserve"> </w:t>
+      </w:r>
+      <m:oMath>
+        <m:r>
+          <m:t>β</m:t>
+        </m:r>
+      </m:oMath>
+      <w:r>
+        <w:t xml:space="preserve"> </w:t>
+      </w:r>
+      <w:r>
+        <w:t xml:space="preserve">was about 5% higher, and the variance of that estimate about 10% higher, in the model incorporating sampling uncertainty compared to the model of point estimates. A difference of this magnitude is unlikely to qualitatively change any inferences drawn from a model.</w:t>
       </w:r>
     </w:p>
     <w:bookmarkEnd w:id="34"/>
@@ -4679,7 +4693,7 @@
         <w:pStyle w:val="FirstParagraph"/>
       </w:pPr>
       <w:r>
-        <w:t xml:space="preserve">Sampling uncertainty in the transition rates underlying MPMs can, in principle, lead to substantial uncertainty in the parameters that researchers derive from MPMs, and which they are ultimately interested in. However, such uncertainty may not meaningfully impact the inferences drawn from any given analysis of published MPMs, if the number of MPMs or magnitude of the effect are large relative to the degree of within-MPM sampling uncertainty. In our study, accounting for transition-rate sampling uncertainty moderately affected the results of a comparative analysis relating to mortality trajectories, but had little impact on a within-species analysis of the effect of weather on demographic traits. Our analysis cannot definitively determine whether any other analysis of published MPMs will suffer from bias or overconfidence if transition-rate sampling uncertainty is ignored, but does highlight some critical issues that researchers should be aware of.</w:t>
+        <w:t xml:space="preserve">Sampling uncertainty in the transition rates underlying MPMs can, in principle, lead to substantial uncertainty in the parameters that researchers derive from MPMs and are ultimately interested in. However, such uncertainty may not meaningfully impact the inferences drawn from any given analysis of published MPMs, if the number of MPMs or magnitude of the effect are large relative to the degree of within-MPM sampling uncertainty. In our study, accounting for transition-rate sampling uncertainty moderately affected the results of a comparative analysis relating to mortality trajectories, but had little impact on a within-species analysis of the effect of weather on demographic traits. Our analysis cannot definitively determine whether any other analysis of published MPMs will suffer from bias or overconfidence if transition-rate sampling uncertainty is ignored, but it does highlight some critical issues that researchers should be aware of.</w:t>
       </w:r>
     </w:p>
     <w:p>
@@ -4687,7 +4701,7 @@
         <w:pStyle w:val="BodyText"/>
       </w:pPr>
       <w:r>
-        <w:t xml:space="preserve">Perhaps the most significant issue highlighted by our analysis was that transition-rate sampling uncertainty may be a substantial component of the total variation in some MPM-derived parameters. In other words, for some parameters, much of the variation observed among published MPMs is not distinguishable from statistical noise. In our analysis, the most-affected parameter was the shape of the mortality distribution, for which almost half of the total variation was due to sampling uncertainty. We don’t know exactly why this particular parameter was so strongly affected. It could be that stage-structured MPMs are simply too coarse an instrument to yield reliable information about age-trajectories of mortality — particularly if we want to start from reproductive maturity (i.e. the starting point most relevant to evolutionary theory on senescence). For example, among the species-averaged MPMs in COMPADRE, 35% have been parameterized with a single reproductive stage class, meaning they yield no information about age-related variation among individuals that achieve and then remain in the reproductive class until death. Among MPMs with two or more reproductive stage classes, 28% have a time to quasi-stable distribution that’s less than one life expectancy, meaning that we only have reliable mortality estimates for relatively young age classes. We do not mean to suggest that researchers should never derive metrics like shape from stage-structured MPMs, but caution may be warranted in such analyses.</w:t>
+        <w:t xml:space="preserve">Perhaps the most significant issue highlighted by our analysis was that transition-rate sampling uncertainty may be a substantial component of the total variation in some MPM-derived parameters. In other words, for some parameters, much of the variation observed among published MPMs is not distinguishable from statistical noise. In our analysis, the most-affected parameter was the shape of the mortality distribution, for which almost half of the total variation was due to sampling uncertainty. We don’t know exactly why this particular parameter was so strongly affected. It could be that stage-structured MPMs are simply too coarse an instrument to yield reliable information about age-trajectories of mortality — particularly if we want to start from reproductive maturity (i.e. the starting point most relevant to evolutionary theory on senescence). For example, among the species-averaged MPMs in COMPADRE, 35% have been parameterised with a single reproductive stage class, meaning they yield no information about age-related variation among individuals that achieve and then remain in the reproductive class until death. Among MPMs with two or more reproductive stage classes, 28% have a time to quasi-stable distribution that’s less than one life expectancy, meaning that we only have reliable mortality estimates for relatively young age classes. We do not mean to suggest that researchers should never derive metrics like shape from stage-structured MPMs, but caution may be warranted in such analyses.</w:t>
       </w:r>
     </w:p>
     <w:p>
@@ -4695,7 +4709,7 @@
         <w:pStyle w:val="BodyText"/>
       </w:pPr>
       <w:r>
-        <w:t xml:space="preserve">Another issue highlighted by our analysis was that some MPM-derived parameters are sensitive to boundary estimates of stage-specific survival (i.e. point estimates approaching either 0% or 100%). For instance, if an MPM has a stage-specific survival rate for which the point estimate is 100%, the resulting point estimate for life expectancy will likely be skewed upward from the median of the sampling distribution. If two or more stage classes have a survival estimate of 100%, this skew can be extreme. Estimating the frequency of rare events is notoriously difficult (Bailey 1997), and estimating the corresponding uncertainty is no easier. Empirical bootstrapping (Caswell 2001, sec. 12.1), a technique commonly used to estimate sampling uncertainty in demographic studies, is poorly suited for analyzing boundary estimates, because any bootstrap subsample from a group of individuals that all experienced the same outcome will always yield the exact same estimate. On the other hand, the particular approach to parametric bootstrapping used in the current study is not necessarily optimal for MPMs parameterized with multiple adult stage classes, for which it may be possible to</w:t>
+        <w:t xml:space="preserve">Another issue highlighted by our analysis was that some MPM-derived parameters are sensitive to boundary estimates of stage-specific survival (i.e. point estimates approaching either 0% or 100%). For instance, if an MPM has a stage-specific survival rate for which the point estimate is 100%, the resulting point estimate for life expectancy will likely be skewed upward from the median of the sampling distribution. If two or more stage classes have a survival estimate of 100%, this skew can be extreme. Estimating the frequency of rare events is notoriously difficult (Bailey 1997), and estimating the corresponding uncertainty is no easier. Empirical bootstrapping (Caswell 2001, sec. 12.1), a technique commonly used to estimate sampling uncertainty in demographic studies, is poorly suited for analysing boundary estimates, because any bootstrap subsample from a group of individuals that all experienced the same outcome will always yield the exact same estimate. On the other hand, the particular approach to parametric bootstrapping used in the current study is not necessarily optimal for MPMs parameterised with multiple adult stage classes, for which it may be possible to</w:t>
       </w:r>
       <w:r>
         <w:t xml:space="preserve"> </w:t>
@@ -4741,7 +4755,7 @@
         <w:pStyle w:val="BodyText"/>
       </w:pPr>
       <w:r>
-        <w:t xml:space="preserve">The second challenge to incorporating transition-rate sampling uncertainty into analyses of published MPMs is the additional modeling effort required. Analyses of published MPMs may draw data from hundreds of studies (COMPADRE currently contains MPMs from 616 unique studies). Even if all those studies reported all underlying data, the effort required to collect that data and model sampling uncertainty for that many studies would be enormous. Further, there’s rarely a single</w:t>
+        <w:t xml:space="preserve">The second challenge to incorporating transition-rate sampling uncertainty into analyses of published MPMs is the additional modelling effort required. Analyses of published MPMs may draw data from hundreds of studies (COMPADRE currently contains MPMs from 616 unique studies). Even if all those studies reported all underlying data, the effort required to collect that data and model sampling uncertainty for that many studies would be enormous. Further, there’s rarely a single</w:t>
       </w:r>
       <w:r>
         <w:t xml:space="preserve"> </w:t>
@@ -4753,7 +4767,7 @@
         <w:t xml:space="preserve"> </w:t>
       </w:r>
       <w:r>
-        <w:t xml:space="preserve">approach to modeling transition rates. For instance, if demographic data are collected from multiple sites over multiple years, should we pool data across sites and years, or partially pool using a hierarchical model? In the latter case, should the factors be crossed or nested? For count data underlying reproductive transitions, should we use Poisson or negative binomial distributions? Such decisions should be informed by the specifics of each study, which makes this type of analysis difficult to apply at scale. That said, the lack of a single, perfect approach shouldn’t deter us from taking steps toward a more rigorous accounting of uncertainty.</w:t>
+        <w:t xml:space="preserve">approach to modelling transition rates. For instance, if demographic data are collected from multiple sites over multiple years, should we pool data across sites and years, or partially pool using a hierarchical model? In the latter case, should the factors be crossed or nested? For count data underlying reproductive transitions, should we use Poisson or negative binomial distributions? Such decisions should be informed by the specifics of each study, which makes this type of analysis difficult to apply at scale. That said, the lack of a single, perfect approach shouldn’t deter us from taking steps towards a more rigorous accounting of uncertainty.</w:t>
       </w:r>
     </w:p>
     <w:bookmarkEnd w:id="37"/>
@@ -4798,7 +4812,7 @@
         <w:pStyle w:val="FirstParagraph"/>
       </w:pPr>
       <w:r>
-        <w:t xml:space="preserve">We are indebted to the COMPADRE data digitization team and management committee for their work in developing the COMPADRE Plant Matrix Database. We thank X for providing information on sample sizes in their studies. This work was supported by a grant from the Independent Research Fund Denmark (grant 6108-00467B).</w:t>
+        <w:t xml:space="preserve">We are indebted to the COMPADRE data digitisation team and management committee for their work in developing the COMPADRE Plant Matrix Database. We thank X for providing information on sample sizes in their studies. This work was supported by a grant from the Independent Research Fund Denmark (grant 6108-00467B).</w:t>
       </w:r>
     </w:p>
     <w:bookmarkEnd w:id="40"/>

</xml_diff>